<commit_message>
feat: add baseline diagnostics and node resources
</commit_message>
<xml_diff>
--- a/docs/智联计算系统测试方案-正式修订版.docx
+++ b/docs/智联计算系统测试方案-正式修订版.docx
@@ -535,7 +535,7 @@
                 <w:b w:val="0"/>
                 <w:sz w:val="21"/>
               </w:rPr>
-              <w:t>10. 展开工单详情，检查业务输入、路由放置、GPU 分配、计算输出和提交给路由系统的 DAG JSON。</w:t>
+              <w:t>10. 展开工单详情，检查业务输入、路由放置、GPU 分配、部署状态、计算输出和结果文件。</w:t>
             </w:r>
           </w:p>
           <w:p>
@@ -1230,7 +1230,7 @@
                 <w:b w:val="0"/>
                 <w:sz w:val="21"/>
               </w:rPr>
-              <w:t>11. 展开工单详情，检查业务输入、DAG JSON、GPU 分配、检测类别、画框坐标和带框预览图。</w:t>
+              <w:t>11. 展开工单详情，检查业务输入、路由放置、GPU 分配、部署状态、检测类别、画框坐标和带框预览图。</w:t>
             </w:r>
           </w:p>
           <w:p>
@@ -1489,7 +1489,7 @@
                 <w:b w:val="0"/>
                 <w:sz w:val="21"/>
               </w:rPr>
-              <w:t>验证用户通过对话输入业务需求后，系统能够生成结构化解析结果，并提供路由 DAG JSON 预览或工单提交入口。</w:t>
+              <w:t>验证用户通过对话输入业务需求后，系统能够生成结构化解析结果，并完成工单提交。</w:t>
             </w:r>
           </w:p>
         </w:tc>
@@ -1613,7 +1613,7 @@
                 <w:b w:val="0"/>
                 <w:sz w:val="21"/>
               </w:rPr>
-              <w:t>4. 用户查看路由 DAG JSON 预览，确认 source、compute、sink 节点、资源需求和链路带宽字段已生成。</w:t>
+              <w:t>4. 用户确认提交任务，系统生成工单并在工单中心展示任务状态。</w:t>
             </w:r>
           </w:p>
           <w:p>
@@ -1735,7 +1735,7 @@
                 <w:b w:val="0"/>
                 <w:sz w:val="21"/>
               </w:rPr>
-              <w:t>当前系统已实现意图对话、参数草稿、确认提交、工单生成和路由请求记录，可在页面展示结构化参数和 DAG JSON。</w:t>
+              <w:t>当前系统已实现意图对话、参数草稿、确认提交、工单生成和路由请求记录，可在页面展示结构化参数和工单详情。</w:t>
             </w:r>
           </w:p>
         </w:tc>

</xml_diff>

<commit_message>
docs: clarify benchmark baseline criteria
</commit_message>
<xml_diff>
--- a/docs/智联计算系统测试方案-正式修订版.docx
+++ b/docs/智联计算系统测试方案-正式修订版.docx
@@ -24,6 +24,16 @@
           <w:sz w:val="21"/>
         </w:rPr>
         <w:t>本文档仅保留当前负责的两个验收指标相关测试用例：业务目标成功率和意图解析参数提取准确率。测试业务参数采用固定输入，任务开始与结束时间由系统工单字段填写，不采用人工计时；页面需展示每个任务的指标结果、阈值、是否达标和汇总成功率计算过程。</w:t>
+      </w:r>
+    </w:p>
+    <w:p>
+      <w:r>
+        <w:rPr>
+          <w:rFonts w:ascii="宋体" w:hAnsi="宋体" w:eastAsia="宋体"/>
+          <w:b w:val="0"/>
+          <w:sz w:val="21"/>
+        </w:rPr>
+        <w:t>业务目标成功率采用节点同业务参数历史基线作为比较对象。矩阵乘法吞吐量越高越好，单任务达标条件为实际吞吐量不低于节点基线的 80%；视频AI推理时延越低越好，统一解释为业务能力保持率不低于 80%，等价为实际 P90 帧推理时延不超过节点基线 P90 时延的 1.25 倍。该裕量用于覆盖容器化运行、网络转发和系统调度带来的正常波动，不用于容忍同一 GPU 多任务争用。</w:t>
       </w:r>
     </w:p>
     <w:p>
@@ -212,17 +222,27 @@
                 <w:b w:val="0"/>
                 <w:sz w:val="21"/>
               </w:rPr>
-              <w:t>3. 已在参与调度的算力节点上完成相同固定参数的历史基线测试。</w:t>
-            </w:r>
-          </w:p>
-          <w:p>
-            <w:r>
-              <w:rPr>
-                <w:rFonts w:ascii="宋体" w:hAnsi="宋体" w:eastAsia="宋体"/>
-                <w:b w:val="0"/>
-                <w:sz w:val="21"/>
-              </w:rPr>
-              <w:t>4. 测试参数固定为 matrix_size=1024、batch_count=50、observation_duration_sec=10、min_samples=5；单个工单业务时间窗口不小于 5 分钟。</w:t>
+              <w:t>3. 正式验收前可清理历史测评轮次、失败/取消工单和残留容器实例，避免历史脏数据进入当前轮次统计；如需保留历史工单作为参考，应按验收轮次编号筛选当前轮次。</w:t>
+            </w:r>
+          </w:p>
+          <w:p>
+            <w:r>
+              <w:rPr>
+                <w:rFonts w:ascii="宋体" w:hAnsi="宋体" w:eastAsia="宋体"/>
+                <w:b w:val="0"/>
+                <w:sz w:val="21"/>
+              </w:rPr>
+              <w:t>4. 已在参与调度的算力节点上完成相同固定参数的历史基线测试：系统通过节点代理在目标节点启动基线容器，使用与正式业务一致的镜像、GPU 计算路径和固定矩阵参数重复 3 次，取中位数作为该节点基线；同时记录原始样本、标准差、后端类型和 GPU 诊断信息，标准差超过中位数 10% 的节点不纳入本轮自动路由。</w:t>
+            </w:r>
+          </w:p>
+          <w:p>
+            <w:r>
+              <w:rPr>
+                <w:rFonts w:ascii="宋体" w:hAnsi="宋体" w:eastAsia="宋体"/>
+                <w:b w:val="0"/>
+                <w:sz w:val="21"/>
+              </w:rPr>
+              <w:t>5. 测试参数固定为 matrix_size=1024、batch_count=50、observation_duration_sec=10、min_samples=5；单个工单业务时间窗口不小于 5 分钟。</w:t>
             </w:r>
           </w:p>
         </w:tc>
@@ -275,7 +295,7 @@
                 <w:b w:val="0"/>
                 <w:sz w:val="21"/>
               </w:rPr>
-              <w:t>2. 检查基线区域，确认参与调度的计算节点均有稳定基线值。</w:t>
+              <w:t>2. 按需清理历史测评工单、失败记录和残留容器实例，确认当前验收轮次从新工单开始统计。</w:t>
             </w:r>
           </w:p>
           <w:p>
@@ -288,7 +308,20 @@
                 <w:b w:val="0"/>
                 <w:sz w:val="21"/>
               </w:rPr>
-              <w:t>3. 创建 30 个压测工单，系统生成当前验收轮次 matmul-formal-20260610-01，并写入固定业务参数。</w:t>
+              <w:t>3. 检查基线区域，确认参与调度的计算节点均有稳定基线值；如镜像、硬件、GPU 驱动或业务参数发生变化，应重新运行基线测试。</w:t>
+            </w:r>
+          </w:p>
+          <w:p>
+            <w:pPr>
+              <w:spacing w:after="40"/>
+            </w:pPr>
+            <w:r>
+              <w:rPr>
+                <w:rFonts w:ascii="宋体" w:hAnsi="宋体" w:eastAsia="宋体"/>
+                <w:b w:val="0"/>
+                <w:sz w:val="21"/>
+              </w:rPr>
+              <w:t>4. 创建 30 个测评工单，系统生成当前验收轮次 matmul-formal-20260610-01，并写入固定业务参数。</w:t>
             </w:r>
           </w:p>
           <w:p>
@@ -301,7 +334,7 @@
                 <w:b/>
                 <w:sz w:val="19"/>
               </w:rPr>
-              <w:t>图1-5-1 矩阵乘法任务基线和固定压测参数</w:t>
+              <w:t>图1-5-1 矩阵乘法任务基线和固定测评参数</w:t>
             </w:r>
           </w:p>
           <w:p>
@@ -353,7 +386,7 @@
                 <w:b w:val="0"/>
                 <w:sz w:val="21"/>
               </w:rPr>
-              <w:t>4. 路由模块为每个工单写回 source、compute、sink 放置结果，compute 节点携带 GPU 分配信息；外部路由系统未接入时可使用内置随机路由策略完成闭环演示。</w:t>
+              <w:t>5. 路由模块为每个工单写回 source、compute、sink 放置结果，compute 节点携带 GPU 分配信息；部署前由系统校验节点和 GPU 分配冲突。</w:t>
             </w:r>
           </w:p>
           <w:p>
@@ -366,7 +399,7 @@
                 <w:b w:val="0"/>
                 <w:sz w:val="21"/>
               </w:rPr>
-              <w:t>5. 点击自动执行，系统按计算节点和 GPU 编号形成执行槽位，单槽位单任务并发，避免 GPU 争用影响业务目标判定。</w:t>
+              <w:t>6. 点击运行测评，系统按小批次执行本轮工单，正式测评时同一 GPU 同一时刻最多运行 1 个任务，避免 GPU 争用影响业务目标判定。</w:t>
             </w:r>
           </w:p>
           <w:p>
@@ -379,7 +412,7 @@
                 <w:b w:val="0"/>
                 <w:sz w:val="21"/>
               </w:rPr>
-              <w:t>6. 业务计算节点跳过预热阶段后持续采集吞吐样本，计算有效浮点运算吞吐量，计算方式为 (2 × N³ × 本轮计算批次数) / 本轮耗时 / 1e9。</w:t>
+              <w:t>7. 业务计算节点跳过预热阶段后持续采集吞吐样本，计算有效浮点运算吞吐量，计算方式为 (2 × N³ × 本轮计算批次数) / 本轮耗时 / 1e9。</w:t>
             </w:r>
           </w:p>
           <w:p>
@@ -392,7 +425,7 @@
                 <w:b w:val="0"/>
                 <w:sz w:val="21"/>
               </w:rPr>
-              <w:t>7. 系统上报单任务实际计算速率、节点基线、达标阈值、采样点数和运行结果。</w:t>
+              <w:t>8. 系统上报单任务实际计算速率、节点基线、达标阈值、采样点数和运行结果。</w:t>
             </w:r>
           </w:p>
           <w:p>
@@ -405,7 +438,7 @@
                 <w:b w:val="0"/>
                 <w:sz w:val="21"/>
               </w:rPr>
-              <w:t>8. 在工单列表中查看每个任务的实际指标、阈值和是否达标。</w:t>
+              <w:t>9. 在工单列表中查看每个任务的实际指标、阈值和是否达标。</w:t>
             </w:r>
           </w:p>
           <w:p>
@@ -470,7 +503,7 @@
                 <w:b w:val="0"/>
                 <w:sz w:val="21"/>
               </w:rPr>
-              <w:t>9. 系统按“业务目标成功率 = 达标任务数 / 可评价任务数 × 100%”汇总展示，当前轮次 30/30 达标。</w:t>
+              <w:t>10. 系统按“业务目标成功率 = 达标任务数 / 可评价任务数 × 100%”汇总展示，当前轮次 30/30 达标。</w:t>
             </w:r>
           </w:p>
           <w:p>
@@ -535,7 +568,7 @@
                 <w:b w:val="0"/>
                 <w:sz w:val="21"/>
               </w:rPr>
-              <w:t>10. 展开工单详情，检查业务输入、路由放置、GPU 分配、部署状态、计算输出和结果文件。</w:t>
+              <w:t>11. 展开工单详情，检查业务输入、路由放置、GPU 分配、部署状态、计算输出和结果文件。</w:t>
             </w:r>
           </w:p>
           <w:p>
@@ -894,17 +927,27 @@
                 <w:b w:val="0"/>
                 <w:sz w:val="21"/>
               </w:rPr>
-              <w:t>4. 已在参与调度的算力节点上完成相同视频参数的历史基线测试。</w:t>
-            </w:r>
-          </w:p>
-          <w:p>
-            <w:r>
-              <w:rPr>
-                <w:rFonts w:ascii="宋体" w:hAnsi="宋体" w:eastAsia="宋体"/>
-                <w:b w:val="0"/>
-                <w:sz w:val="21"/>
-              </w:rPr>
-              <w:t>5. 测试参数固定为 frame_count=100、frame_stride=30、warmup_frames=10、measured_frames=30；单个工单业务时间窗口不小于 5 分钟。</w:t>
+              <w:t>4. 正式验收前可清理历史测评轮次、失败/取消工单和残留容器实例，避免旧工单、旧结果或已停止容器影响当前轮次展示和资源占用。</w:t>
+            </w:r>
+          </w:p>
+          <w:p>
+            <w:r>
+              <w:rPr>
+                <w:rFonts w:ascii="宋体" w:hAnsi="宋体" w:eastAsia="宋体"/>
+                <w:b w:val="0"/>
+                <w:sz w:val="21"/>
+              </w:rPr>
+              <w:t>5. 已在参与调度的算力节点上完成相同视频参数的历史基线测试：系统通过节点代理在目标节点启动基线容器，使用与正式业务一致的固定视频、YOLOv5n 权重、GPU 推理后端和视频参数，先进行 3 轮外层预热，再正式测量 5 轮，每轮内部跳过 warmup_frames 后统计 measured_frames 的 P90 帧推理时延，取 5 轮中位数作为该节点基线；标准差超过中位数 10% 的节点不纳入本轮自动路由。仅开发调试路径产生的 CPU 或模拟推理结果不得作为正式基线。</w:t>
+            </w:r>
+          </w:p>
+          <w:p>
+            <w:r>
+              <w:rPr>
+                <w:rFonts w:ascii="宋体" w:hAnsi="宋体" w:eastAsia="宋体"/>
+                <w:b w:val="0"/>
+                <w:sz w:val="21"/>
+              </w:rPr>
+              <w:t>6. 测试参数固定为 frame_count=100、frame_stride=30、warmup_frames=10、measured_frames=30；单个工单业务时间窗口不小于 5 分钟。</w:t>
             </w:r>
           </w:p>
         </w:tc>
@@ -957,7 +1000,7 @@
                 <w:b w:val="0"/>
                 <w:sz w:val="21"/>
               </w:rPr>
-              <w:t>2. 检查基线区域，确认参与调度的计算节点均有当前视频参数对应的稳定基线时延。</w:t>
+              <w:t>2. 按需清理历史测评工单、失败记录和残留容器实例，确认当前验收轮次从新工单开始统计。</w:t>
             </w:r>
           </w:p>
           <w:p>
@@ -970,7 +1013,20 @@
                 <w:b w:val="0"/>
                 <w:sz w:val="21"/>
               </w:rPr>
-              <w:t>3. 创建 30 个压测工单，系统生成当前验收轮次 video-formal-20260610-01，并写入固定视频输入参数。</w:t>
+              <w:t>3. 检查基线区域，确认参与调度的计算节点均有当前视频参数对应的稳定基线时延。</w:t>
+            </w:r>
+          </w:p>
+          <w:p>
+            <w:pPr>
+              <w:spacing w:after="40"/>
+            </w:pPr>
+            <w:r>
+              <w:rPr>
+                <w:rFonts w:ascii="宋体" w:hAnsi="宋体" w:eastAsia="宋体"/>
+                <w:b w:val="0"/>
+                <w:sz w:val="21"/>
+              </w:rPr>
+              <w:t>4. 创建 30 个测评工单，系统生成当前验收轮次 video-formal-20260610-01，并写入固定视频输入参数。</w:t>
             </w:r>
           </w:p>
           <w:p>
@@ -983,7 +1039,7 @@
                 <w:b/>
                 <w:sz w:val="19"/>
               </w:rPr>
-              <w:t>图1-6-1 视频AI推理任务基线和固定压测参数</w:t>
+              <w:t>图1-6-1 视频AI推理任务基线和固定测评参数</w:t>
             </w:r>
           </w:p>
           <w:p>
@@ -1035,7 +1091,7 @@
                 <w:b w:val="0"/>
                 <w:sz w:val="21"/>
               </w:rPr>
-              <w:t>4. 路由模块写回 source、compute、sink 放置结果，compute 节点携带 GPU 分配信息；部署系统对 GPU 冲突进行兜底校验。</w:t>
+              <w:t>5. 路由模块写回 source、compute、sink 放置结果，compute 节点携带 GPU 分配信息；部署系统对 GPU 冲突进行兜底校验。</w:t>
             </w:r>
           </w:p>
           <w:p>
@@ -1048,7 +1104,7 @@
                 <w:b w:val="0"/>
                 <w:sz w:val="21"/>
               </w:rPr>
-              <w:t>5. 点击自动执行，系统按计算节点和 GPU 编号形成执行槽位，单槽位单任务并发，避免同一 GPU 被多个视频推理任务争用。</w:t>
+              <w:t>6. 点击运行测评，系统按小批次执行本轮工单，正式测评时同一 GPU 同一时刻最多运行 1 个视频推理任务，避免并发争用影响帧推理时延。</w:t>
             </w:r>
           </w:p>
           <w:p>
@@ -1061,7 +1117,7 @@
                 <w:b w:val="0"/>
                 <w:sz w:val="21"/>
               </w:rPr>
-              <w:t>6. source 节点读取固定测试视频并按 frame_stride 抽帧发送给 compute 节点。</w:t>
+              <w:t>7. source 节点读取固定测试视频并按 frame_stride 抽帧发送给 compute 节点。</w:t>
             </w:r>
           </w:p>
           <w:p>
@@ -1074,7 +1130,7 @@
                 <w:b w:val="0"/>
                 <w:sz w:val="21"/>
               </w:rPr>
-              <w:t>7. compute 节点加载 YOLOv5n 权重，跳过 warmup_frames 后统计 measured_frames 的逐帧推理时延，并生成中文分类标签和检测框。</w:t>
+              <w:t>8. compute 节点加载 YOLOv5n 权重，跳过 warmup_frames 后统计 measured_frames 的逐帧推理时延，并生成中文分类标签和检测框。</w:t>
             </w:r>
           </w:p>
           <w:p>
@@ -1087,7 +1143,7 @@
                 <w:b w:val="0"/>
                 <w:sz w:val="21"/>
               </w:rPr>
-              <w:t>8. sink 节点汇总并上报 frame_latency_p90_ms、有效帧数、检测类别、画框坐标和带框预览图。</w:t>
+              <w:t>9. sink 节点汇总并上报 frame_latency_p90_ms、有效帧数、检测类别、画框坐标和带框预览图。</w:t>
             </w:r>
           </w:p>
           <w:p>
@@ -1100,7 +1156,7 @@
                 <w:b w:val="0"/>
                 <w:sz w:val="21"/>
               </w:rPr>
-              <w:t>9. 在工单列表中查看每个任务的 P90 帧推理时延、阈值和是否达标。</w:t>
+              <w:t>10. 在工单列表中查看每个任务的 P90 帧推理时延、阈值和是否达标；视频时延越低越好，达标阈值按“节点基准 P90 时延 ÷ 0.8”计算，即最多允许比基线高 25%。</w:t>
             </w:r>
           </w:p>
           <w:p>
@@ -1165,7 +1221,7 @@
                 <w:b w:val="0"/>
                 <w:sz w:val="21"/>
               </w:rPr>
-              <w:t>10. 系统按“业务目标成功率 = 达标任务数 / 可评价任务数 × 100%”汇总展示，当前轮次 30/30 达标。</w:t>
+              <w:t>11. 系统按“业务目标成功率 = 达标任务数 / 可评价任务数 × 100%”汇总展示，当前轮次 30/30 达标。</w:t>
             </w:r>
           </w:p>
           <w:p>
@@ -1230,7 +1286,7 @@
                 <w:b w:val="0"/>
                 <w:sz w:val="21"/>
               </w:rPr>
-              <w:t>11. 展开工单详情，检查业务输入、路由放置、GPU 分配、部署状态、检测类别、画框坐标和带框预览图。</w:t>
+              <w:t>12. 展开工单详情，检查业务输入、路由放置、GPU 分配、部署状态、检测类别、画框坐标和带框预览图。</w:t>
             </w:r>
           </w:p>
           <w:p>

</xml_diff>

<commit_message>
Prepare routing integration handoff
</commit_message>
<xml_diff>
--- a/docs/智联计算系统测试方案-正式修订版.docx
+++ b/docs/智联计算系统测试方案-正式修订版.docx
@@ -23,7 +23,7 @@
           <w:b w:val="0"/>
           <w:sz w:val="21"/>
         </w:rPr>
-        <w:t>本文档仅保留当前负责的两个验收指标相关测试用例：业务目标成功率和意图解析参数提取准确率。测试业务参数采用固定输入，任务开始与结束时间由系统工单字段填写，不采用人工计时；页面需展示每个任务的指标结果、阈值、是否达标和汇总成功率计算过程。</w:t>
+        <w:t>本文档仅保留当前负责的两个验收指标相关测试用例：业务目标成功率和意图解析参数提取准确率。测试业务参数采用固定输入，任务开始与结束时间由系统工单字段填写，不采用人工计时；页面需通过测试工单列表展示每个任务的指标结果、阈值、是否达标和汇总成功率计算过程。</w:t>
       </w:r>
     </w:p>
     <w:p>
@@ -151,6 +151,146 @@
                 <w:b/>
                 <w:sz w:val="21"/>
               </w:rPr>
+              <w:t>测试指标</w:t>
+            </w:r>
+          </w:p>
+        </w:tc>
+        <w:tc>
+          <w:tcPr>
+            <w:tcW w:type="dxa" w:w="7800"/>
+          </w:tcPr>
+          <w:p>
+            <w:r/>
+            <w:r>
+              <w:rPr>
+                <w:rFonts w:ascii="宋体" w:hAnsi="宋体" w:eastAsia="宋体"/>
+                <w:b w:val="0"/>
+                <w:sz w:val="21"/>
+              </w:rPr>
+              <w:t>矩阵计算速率 effective_gflops，单位为 GFLOPS，数值越高表示计算能力越强。</w:t>
+            </w:r>
+          </w:p>
+        </w:tc>
+      </w:tr>
+      <w:tr>
+        <w:tc>
+          <w:tcPr>
+            <w:tcW w:type="dxa" w:w="1800"/>
+            <w:shd w:fill="EAF2F8"/>
+          </w:tcPr>
+          <w:p>
+            <w:r/>
+            <w:r>
+              <w:rPr>
+                <w:rFonts w:ascii="宋体" w:hAnsi="宋体" w:eastAsia="宋体"/>
+                <w:b/>
+                <w:sz w:val="21"/>
+              </w:rPr>
+              <w:t>基线说明</w:t>
+            </w:r>
+          </w:p>
+        </w:tc>
+        <w:tc>
+          <w:tcPr>
+            <w:tcW w:type="dxa" w:w="7800"/>
+          </w:tcPr>
+          <w:p>
+            <w:r/>
+            <w:r>
+              <w:rPr>
+                <w:rFonts w:ascii="宋体" w:hAnsi="宋体" w:eastAsia="宋体"/>
+                <w:b w:val="0"/>
+                <w:sz w:val="21"/>
+              </w:rPr>
+              <w:t>正式测试前，对参与调度的算力节点使用相同业务参数进行基线测试，取稳定历史结果作为该节点基线。</w:t>
+            </w:r>
+          </w:p>
+        </w:tc>
+      </w:tr>
+      <w:tr>
+        <w:tc>
+          <w:tcPr>
+            <w:tcW w:type="dxa" w:w="1800"/>
+            <w:shd w:fill="EAF2F8"/>
+          </w:tcPr>
+          <w:p>
+            <w:r/>
+            <w:r>
+              <w:rPr>
+                <w:rFonts w:ascii="宋体" w:hAnsi="宋体" w:eastAsia="宋体"/>
+                <w:b/>
+                <w:sz w:val="21"/>
+              </w:rPr>
+              <w:t>判定方法</w:t>
+            </w:r>
+          </w:p>
+        </w:tc>
+        <w:tc>
+          <w:tcPr>
+            <w:tcW w:type="dxa" w:w="7800"/>
+          </w:tcPr>
+          <w:p>
+            <w:r/>
+            <w:r>
+              <w:rPr>
+                <w:rFonts w:ascii="宋体" w:hAnsi="宋体" w:eastAsia="宋体"/>
+                <w:b w:val="0"/>
+                <w:sz w:val="21"/>
+              </w:rPr>
+              <w:t>单个工单实际计算速率不低于对应节点基线的 80% 时，判定该工单达标。</w:t>
+            </w:r>
+          </w:p>
+        </w:tc>
+      </w:tr>
+      <w:tr>
+        <w:tc>
+          <w:tcPr>
+            <w:tcW w:type="dxa" w:w="1800"/>
+            <w:shd w:fill="EAF2F8"/>
+          </w:tcPr>
+          <w:p>
+            <w:r/>
+            <w:r>
+              <w:rPr>
+                <w:rFonts w:ascii="宋体" w:hAnsi="宋体" w:eastAsia="宋体"/>
+                <w:b/>
+                <w:sz w:val="21"/>
+              </w:rPr>
+              <w:t>统计口径</w:t>
+            </w:r>
+          </w:p>
+        </w:tc>
+        <w:tc>
+          <w:tcPr>
+            <w:tcW w:type="dxa" w:w="7800"/>
+          </w:tcPr>
+          <w:p>
+            <w:r/>
+            <w:r>
+              <w:rPr>
+                <w:rFonts w:ascii="宋体" w:hAnsi="宋体" w:eastAsia="宋体"/>
+                <w:b w:val="0"/>
+                <w:sz w:val="21"/>
+              </w:rPr>
+              <w:t>业务目标成功率 = 达标工单数 / 可评价工单数 × 100%；正式验收要求可评价工单不少于 30 个，成功率不低于 90%。</w:t>
+            </w:r>
+          </w:p>
+        </w:tc>
+      </w:tr>
+      <w:tr>
+        <w:tc>
+          <w:tcPr>
+            <w:tcW w:type="dxa" w:w="1800"/>
+            <w:shd w:fill="EAF2F8"/>
+          </w:tcPr>
+          <w:p>
+            <w:r/>
+            <w:r>
+              <w:rPr>
+                <w:rFonts w:ascii="宋体" w:hAnsi="宋体" w:eastAsia="宋体"/>
+                <w:b/>
+                <w:sz w:val="21"/>
+              </w:rPr>
               <w:t>组网拓扑</w:t>
             </w:r>
           </w:p>
@@ -222,17 +362,17 @@
                 <w:b w:val="0"/>
                 <w:sz w:val="21"/>
               </w:rPr>
-              <w:t>3. 正式验收前可清理历史测评轮次、失败/取消工单和残留容器实例，避免历史脏数据进入当前轮次统计；如需保留历史工单作为参考，应按验收轮次编号筛选当前轮次。</w:t>
-            </w:r>
-          </w:p>
-          <w:p>
-            <w:r>
-              <w:rPr>
-                <w:rFonts w:ascii="宋体" w:hAnsi="宋体" w:eastAsia="宋体"/>
-                <w:b w:val="0"/>
-                <w:sz w:val="21"/>
-              </w:rPr>
-              <w:t>4. 已在参与调度的算力节点上完成相同固定参数的历史基线测试：系统通过节点代理在目标节点启动基线容器，使用与正式业务一致的镜像、GPU 计算路径和固定矩阵参数重复 3 次，取中位数作为该节点基线；同时记录原始样本、标准差、后端类型和 GPU 诊断信息，标准差超过中位数 10% 的节点不纳入本轮自动路由。</w:t>
+              <w:t>3. 已在参与调度的算力节点上完成相同固定参数的历史基线测试。</w:t>
+            </w:r>
+          </w:p>
+          <w:p>
+            <w:r>
+              <w:rPr>
+                <w:rFonts w:ascii="宋体" w:hAnsi="宋体" w:eastAsia="宋体"/>
+                <w:b w:val="0"/>
+                <w:sz w:val="21"/>
+              </w:rPr>
+              <w:t>4. 正式验收前可清理历史测评轮次和残留容器实例，避免旧数据影响当前轮次统计。</w:t>
             </w:r>
           </w:p>
           <w:p>
@@ -295,7 +435,7 @@
                 <w:b w:val="0"/>
                 <w:sz w:val="21"/>
               </w:rPr>
-              <w:t>2. 按需清理历史测评工单、失败记录和残留容器实例，确认当前验收轮次从新工单开始统计。</w:t>
+              <w:t>2. 检查基线区域，确认参与调度的计算节点均有稳定基线值。</w:t>
             </w:r>
           </w:p>
           <w:p>
@@ -308,20 +448,7 @@
                 <w:b w:val="0"/>
                 <w:sz w:val="21"/>
               </w:rPr>
-              <w:t>3. 检查基线区域，确认参与调度的计算节点均有稳定基线值；如镜像、硬件、GPU 驱动或业务参数发生变化，应重新运行基线测试。</w:t>
-            </w:r>
-          </w:p>
-          <w:p>
-            <w:pPr>
-              <w:spacing w:after="40"/>
-            </w:pPr>
-            <w:r>
-              <w:rPr>
-                <w:rFonts w:ascii="宋体" w:hAnsi="宋体" w:eastAsia="宋体"/>
-                <w:b w:val="0"/>
-                <w:sz w:val="21"/>
-              </w:rPr>
-              <w:t>4. 创建 30 个测评工单，系统生成当前验收轮次 matmul-formal-20260610-01，并写入固定业务参数。</w:t>
+              <w:t>3. 创建 30 个测评工单，系统生成当前验收轮次 high_throughput_matmul-20260612095418，并写入固定业务参数。</w:t>
             </w:r>
           </w:p>
           <w:p>
@@ -386,7 +513,7 @@
                 <w:b w:val="0"/>
                 <w:sz w:val="21"/>
               </w:rPr>
-              <w:t>5. 路由模块为每个工单写回 source、compute、sink 放置结果，compute 节点携带 GPU 分配信息；部署前由系统校验节点和 GPU 分配冲突。</w:t>
+              <w:t>4. 路由模块为每个工单写回 source、compute、sink 放置结果，compute 节点携带 GPU 分配信息；部署前由系统校验节点和 GPU 分配冲突。</w:t>
             </w:r>
           </w:p>
           <w:p>
@@ -399,7 +526,7 @@
                 <w:b w:val="0"/>
                 <w:sz w:val="21"/>
               </w:rPr>
-              <w:t>6. 点击运行测评，系统按小批次执行本轮工单，正式测评时同一 GPU 同一时刻最多运行 1 个任务，避免 GPU 争用影响业务目标判定。</w:t>
+              <w:t>5. 点击运行测评，系统按小批次执行本轮工单，同一 GPU 同一时刻最多运行 1 个验收任务。</w:t>
             </w:r>
           </w:p>
           <w:p>
@@ -412,7 +539,7 @@
                 <w:b w:val="0"/>
                 <w:sz w:val="21"/>
               </w:rPr>
-              <w:t>7. 业务计算节点跳过预热阶段后持续采集吞吐样本，计算有效浮点运算吞吐量，计算方式为 (2 × N³ × 本轮计算批次数) / 本轮耗时 / 1e9。</w:t>
+              <w:t>6. 业务计算节点跳过预热阶段后持续采集吞吐样本，计算有效浮点运算吞吐量，计算方式为 (2 × N³ × 本轮计算批次数) / 本轮耗时 / 1e9。</w:t>
             </w:r>
           </w:p>
           <w:p>
@@ -425,7 +552,7 @@
                 <w:b w:val="0"/>
                 <w:sz w:val="21"/>
               </w:rPr>
-              <w:t>8. 系统上报单任务实际计算速率、节点基线、达标阈值、采样点数和运行结果。</w:t>
+              <w:t>7. 系统上报单任务实际计算速率、节点基线、达标阈值、采样点数和运行结果。</w:t>
             </w:r>
           </w:p>
           <w:p>
@@ -438,7 +565,7 @@
                 <w:b w:val="0"/>
                 <w:sz w:val="21"/>
               </w:rPr>
-              <w:t>9. 在工单列表中查看每个任务的实际指标、阈值和是否达标。</w:t>
+              <w:t>8. 在测试工单列表中查看每个任务的实际指标、阈值和是否达标。</w:t>
             </w:r>
           </w:p>
           <w:p>
@@ -503,7 +630,7 @@
                 <w:b w:val="0"/>
                 <w:sz w:val="21"/>
               </w:rPr>
-              <w:t>10. 系统按“业务目标成功率 = 达标任务数 / 可评价任务数 × 100%”汇总展示，当前轮次 30/30 达标。</w:t>
+              <w:t>9. 系统按“业务目标成功率 = 达标任务数 / 可评价任务数 × 100%”汇总展示，当前轮次 30/30 达标。</w:t>
             </w:r>
           </w:p>
           <w:p>
@@ -568,7 +695,7 @@
                 <w:b w:val="0"/>
                 <w:sz w:val="21"/>
               </w:rPr>
-              <w:t>11. 展开工单详情，检查业务输入、路由放置、GPU 分配、部署状态、计算输出和结果文件。</w:t>
+              <w:t>10. 展开工单详情，检查业务输入、路由放置、GPU 分配、部署状态、计算输出和结果文件。</w:t>
             </w:r>
           </w:p>
           <w:p>
@@ -690,41 +817,41 @@
                 <w:b w:val="0"/>
                 <w:sz w:val="21"/>
               </w:rPr>
-              <w:t>当前轮次 matmul-formal-20260610-01 共 30 个工单，30 个可评价且全部达标，业务目标成功率为 100.0%，满足验收要求。</w:t>
-            </w:r>
-          </w:p>
-        </w:tc>
-      </w:tr>
-      <w:tr>
-        <w:tc>
-          <w:tcPr>
-            <w:tcW w:type="dxa" w:w="1800"/>
-            <w:shd w:fill="EAF2F8"/>
-          </w:tcPr>
-          <w:p>
-            <w:r/>
-            <w:r>
-              <w:rPr>
-                <w:rFonts w:ascii="宋体" w:hAnsi="宋体" w:eastAsia="宋体"/>
-                <w:b/>
-                <w:sz w:val="21"/>
-              </w:rPr>
-            </w:r>
-          </w:p>
-        </w:tc>
-        <w:tc>
-          <w:tcPr>
-            <w:tcW w:type="dxa" w:w="7800"/>
-          </w:tcPr>
-          <w:p>
-            <w:r/>
-            <w:r>
-              <w:rPr>
-                <w:rFonts w:ascii="宋体" w:hAnsi="宋体" w:eastAsia="宋体"/>
-                <w:b w:val="0"/>
-                <w:sz w:val="21"/>
-              </w:rPr>
-              <w:t>截图已随测试步骤穿插留档，用于证明页面操作、单任务指标、成功率计算和结果详情。</w:t>
+              <w:t>当前轮次 high_throughput_matmul-20260612095418 共 30 个工单，30 个可评价且全部达标，业务目标成功率为 100.0%，满足验收要求。</w:t>
+            </w:r>
+          </w:p>
+        </w:tc>
+      </w:tr>
+      <w:tr>
+        <w:tc>
+          <w:tcPr>
+            <w:tcW w:type="dxa" w:w="1800"/>
+            <w:shd w:fill="EAF2F8"/>
+          </w:tcPr>
+          <w:p>
+            <w:r/>
+            <w:r>
+              <w:rPr>
+                <w:rFonts w:ascii="宋体" w:hAnsi="宋体" w:eastAsia="宋体"/>
+                <w:b/>
+                <w:sz w:val="21"/>
+              </w:rPr>
+            </w:r>
+          </w:p>
+        </w:tc>
+        <w:tc>
+          <w:tcPr>
+            <w:tcW w:type="dxa" w:w="7800"/>
+          </w:tcPr>
+          <w:p>
+            <w:r/>
+            <w:r>
+              <w:rPr>
+                <w:rFonts w:ascii="宋体" w:hAnsi="宋体" w:eastAsia="宋体"/>
+                <w:b w:val="0"/>
+                <w:sz w:val="21"/>
+              </w:rPr>
+              <w:t>截图已随测试步骤穿插留档，用于证明页面操作、单任务指标、成功率计算和任务工单详情。</w:t>
             </w:r>
           </w:p>
         </w:tc>
@@ -846,6 +973,146 @@
                 <w:b/>
                 <w:sz w:val="21"/>
               </w:rPr>
+              <w:t>测试指标</w:t>
+            </w:r>
+          </w:p>
+        </w:tc>
+        <w:tc>
+          <w:tcPr>
+            <w:tcW w:type="dxa" w:w="7800"/>
+          </w:tcPr>
+          <w:p>
+            <w:r/>
+            <w:r>
+              <w:rPr>
+                <w:rFonts w:ascii="宋体" w:hAnsi="宋体" w:eastAsia="宋体"/>
+                <w:b w:val="0"/>
+                <w:sz w:val="21"/>
+              </w:rPr>
+              <w:t>帧推理 P90 时延 frame_latency_p90_ms，单位为 ms，数值越低表示低时延处理能力越强。</w:t>
+            </w:r>
+          </w:p>
+        </w:tc>
+      </w:tr>
+      <w:tr>
+        <w:tc>
+          <w:tcPr>
+            <w:tcW w:type="dxa" w:w="1800"/>
+            <w:shd w:fill="EAF2F8"/>
+          </w:tcPr>
+          <w:p>
+            <w:r/>
+            <w:r>
+              <w:rPr>
+                <w:rFonts w:ascii="宋体" w:hAnsi="宋体" w:eastAsia="宋体"/>
+                <w:b/>
+                <w:sz w:val="21"/>
+              </w:rPr>
+              <w:t>基线说明</w:t>
+            </w:r>
+          </w:p>
+        </w:tc>
+        <w:tc>
+          <w:tcPr>
+            <w:tcW w:type="dxa" w:w="7800"/>
+          </w:tcPr>
+          <w:p>
+            <w:r/>
+            <w:r>
+              <w:rPr>
+                <w:rFonts w:ascii="宋体" w:hAnsi="宋体" w:eastAsia="宋体"/>
+                <w:b w:val="0"/>
+                <w:sz w:val="21"/>
+              </w:rPr>
+              <w:t>正式测试前，对参与调度的算力节点使用相同固定视频和相同视频参数进行基线测试，取稳定历史结果作为该节点基线。</w:t>
+            </w:r>
+          </w:p>
+        </w:tc>
+      </w:tr>
+      <w:tr>
+        <w:tc>
+          <w:tcPr>
+            <w:tcW w:type="dxa" w:w="1800"/>
+            <w:shd w:fill="EAF2F8"/>
+          </w:tcPr>
+          <w:p>
+            <w:r/>
+            <w:r>
+              <w:rPr>
+                <w:rFonts w:ascii="宋体" w:hAnsi="宋体" w:eastAsia="宋体"/>
+                <w:b/>
+                <w:sz w:val="21"/>
+              </w:rPr>
+              <w:t>判定方法</w:t>
+            </w:r>
+          </w:p>
+        </w:tc>
+        <w:tc>
+          <w:tcPr>
+            <w:tcW w:type="dxa" w:w="7800"/>
+          </w:tcPr>
+          <w:p>
+            <w:r/>
+            <w:r>
+              <w:rPr>
+                <w:rFonts w:ascii="宋体" w:hAnsi="宋体" w:eastAsia="宋体"/>
+                <w:b w:val="0"/>
+                <w:sz w:val="21"/>
+              </w:rPr>
+              <w:t>单个工单实际 P90 时延不超过对应节点基线 P90 时延的 1.25 倍时，判定该工单达标。</w:t>
+            </w:r>
+          </w:p>
+        </w:tc>
+      </w:tr>
+      <w:tr>
+        <w:tc>
+          <w:tcPr>
+            <w:tcW w:type="dxa" w:w="1800"/>
+            <w:shd w:fill="EAF2F8"/>
+          </w:tcPr>
+          <w:p>
+            <w:r/>
+            <w:r>
+              <w:rPr>
+                <w:rFonts w:ascii="宋体" w:hAnsi="宋体" w:eastAsia="宋体"/>
+                <w:b/>
+                <w:sz w:val="21"/>
+              </w:rPr>
+              <w:t>统计口径</w:t>
+            </w:r>
+          </w:p>
+        </w:tc>
+        <w:tc>
+          <w:tcPr>
+            <w:tcW w:type="dxa" w:w="7800"/>
+          </w:tcPr>
+          <w:p>
+            <w:r/>
+            <w:r>
+              <w:rPr>
+                <w:rFonts w:ascii="宋体" w:hAnsi="宋体" w:eastAsia="宋体"/>
+                <w:b w:val="0"/>
+                <w:sz w:val="21"/>
+              </w:rPr>
+              <w:t>业务目标成功率 = 达标工单数 / 可评价工单数 × 100%；正式验收要求可评价工单不少于 30 个，成功率不低于 90%。</w:t>
+            </w:r>
+          </w:p>
+        </w:tc>
+      </w:tr>
+      <w:tr>
+        <w:tc>
+          <w:tcPr>
+            <w:tcW w:type="dxa" w:w="1800"/>
+            <w:shd w:fill="EAF2F8"/>
+          </w:tcPr>
+          <w:p>
+            <w:r/>
+            <w:r>
+              <w:rPr>
+                <w:rFonts w:ascii="宋体" w:hAnsi="宋体" w:eastAsia="宋体"/>
+                <w:b/>
+                <w:sz w:val="21"/>
+              </w:rPr>
               <w:t>组网拓扑</w:t>
             </w:r>
           </w:p>
@@ -927,17 +1194,17 @@
                 <w:b w:val="0"/>
                 <w:sz w:val="21"/>
               </w:rPr>
-              <w:t>4. 正式验收前可清理历史测评轮次、失败/取消工单和残留容器实例，避免旧工单、旧结果或已停止容器影响当前轮次展示和资源占用。</w:t>
-            </w:r>
-          </w:p>
-          <w:p>
-            <w:r>
-              <w:rPr>
-                <w:rFonts w:ascii="宋体" w:hAnsi="宋体" w:eastAsia="宋体"/>
-                <w:b w:val="0"/>
-                <w:sz w:val="21"/>
-              </w:rPr>
-              <w:t>5. 已在参与调度的算力节点上完成相同视频参数的历史基线测试：系统通过节点代理在目标节点启动基线容器，使用与正式业务一致的固定视频、YOLOv5n 权重、GPU 推理后端和视频参数，先进行 3 轮外层预热，再正式测量 5 轮，每轮内部跳过 warmup_frames 后统计 measured_frames 的 P90 帧推理时延，取 5 轮中位数作为该节点基线；标准差超过中位数 10% 的节点不纳入本轮自动路由。仅开发调试路径产生的 CPU 或模拟推理结果不得作为正式基线。</w:t>
+              <w:t>4. 已在参与调度的算力节点上完成相同视频参数的历史基线测试。</w:t>
+            </w:r>
+          </w:p>
+          <w:p>
+            <w:r>
+              <w:rPr>
+                <w:rFonts w:ascii="宋体" w:hAnsi="宋体" w:eastAsia="宋体"/>
+                <w:b w:val="0"/>
+                <w:sz w:val="21"/>
+              </w:rPr>
+              <w:t>5. 正式验收前可清理历史测评轮次和残留容器实例，避免旧数据影响当前轮次统计。</w:t>
             </w:r>
           </w:p>
           <w:p>
@@ -1000,7 +1267,7 @@
                 <w:b w:val="0"/>
                 <w:sz w:val="21"/>
               </w:rPr>
-              <w:t>2. 按需清理历史测评工单、失败记录和残留容器实例，确认当前验收轮次从新工单开始统计。</w:t>
+              <w:t>2. 检查基线区域，确认参与调度的计算节点均有当前视频参数对应的稳定基线时延。</w:t>
             </w:r>
           </w:p>
           <w:p>
@@ -1013,20 +1280,7 @@
                 <w:b w:val="0"/>
                 <w:sz w:val="21"/>
               </w:rPr>
-              <w:t>3. 检查基线区域，确认参与调度的计算节点均有当前视频参数对应的稳定基线时延。</w:t>
-            </w:r>
-          </w:p>
-          <w:p>
-            <w:pPr>
-              <w:spacing w:after="40"/>
-            </w:pPr>
-            <w:r>
-              <w:rPr>
-                <w:rFonts w:ascii="宋体" w:hAnsi="宋体" w:eastAsia="宋体"/>
-                <w:b w:val="0"/>
-                <w:sz w:val="21"/>
-              </w:rPr>
-              <w:t>4. 创建 30 个测评工单，系统生成当前验收轮次 video-formal-20260610-01，并写入固定视频输入参数。</w:t>
+              <w:t>3. 创建 30 个测评工单，系统生成当前视频AI推理正式验收轮次，并写入固定视频输入参数。</w:t>
             </w:r>
           </w:p>
           <w:p>
@@ -1091,7 +1345,7 @@
                 <w:b w:val="0"/>
                 <w:sz w:val="21"/>
               </w:rPr>
-              <w:t>5. 路由模块写回 source、compute、sink 放置结果，compute 节点携带 GPU 分配信息；部署系统对 GPU 冲突进行兜底校验。</w:t>
+              <w:t>4. 路由模块写回 source、compute、sink 放置结果，compute 节点携带 GPU 分配信息；部署系统对 GPU 冲突进行兜底校验。</w:t>
             </w:r>
           </w:p>
           <w:p>
@@ -1104,7 +1358,7 @@
                 <w:b w:val="0"/>
                 <w:sz w:val="21"/>
               </w:rPr>
-              <w:t>6. 点击运行测评，系统按小批次执行本轮工单，正式测评时同一 GPU 同一时刻最多运行 1 个视频推理任务，避免并发争用影响帧推理时延。</w:t>
+              <w:t>5. 点击运行测评，系统按小批次执行本轮工单，同一 GPU 同一时刻最多运行 1 个视频推理任务。</w:t>
             </w:r>
           </w:p>
           <w:p>
@@ -1117,7 +1371,7 @@
                 <w:b w:val="0"/>
                 <w:sz w:val="21"/>
               </w:rPr>
-              <w:t>7. source 节点读取固定测试视频并按 frame_stride 抽帧发送给 compute 节点。</w:t>
+              <w:t>6. source 节点读取固定测试视频并按 frame_stride 抽帧发送给 compute 节点。</w:t>
             </w:r>
           </w:p>
           <w:p>
@@ -1130,7 +1384,7 @@
                 <w:b w:val="0"/>
                 <w:sz w:val="21"/>
               </w:rPr>
-              <w:t>8. compute 节点加载 YOLOv5n 权重，跳过 warmup_frames 后统计 measured_frames 的逐帧推理时延，并生成中文分类标签和检测框。</w:t>
+              <w:t>7. compute 节点加载 YOLOv5n 权重，跳过 warmup_frames 后统计 measured_frames 的逐帧推理时延，并生成中文分类标签和检测框。</w:t>
             </w:r>
           </w:p>
           <w:p>
@@ -1143,7 +1397,7 @@
                 <w:b w:val="0"/>
                 <w:sz w:val="21"/>
               </w:rPr>
-              <w:t>9. sink 节点汇总并上报 frame_latency_p90_ms、有效帧数、检测类别、画框坐标和带框预览图。</w:t>
+              <w:t>8. sink 节点汇总并上报 frame_latency_p90_ms、有效帧数、检测类别、画框坐标和带框预览图。</w:t>
             </w:r>
           </w:p>
           <w:p>
@@ -1156,7 +1410,7 @@
                 <w:b w:val="0"/>
                 <w:sz w:val="21"/>
               </w:rPr>
-              <w:t>10. 在工单列表中查看每个任务的 P90 帧推理时延、阈值和是否达标；视频时延越低越好，达标阈值按“节点基准 P90 时延 ÷ 0.8”计算，即最多允许比基线高 25%。</w:t>
+              <w:t>9. 在测试工单列表中查看每个任务的 P90 帧推理时延、阈值和是否达标；视频时延越低越好，达标阈值按“节点基准 P90 时延 ÷ 0.8”计算，即最多允许比基线高 25%。</w:t>
             </w:r>
           </w:p>
           <w:p>
@@ -1221,7 +1475,7 @@
                 <w:b w:val="0"/>
                 <w:sz w:val="21"/>
               </w:rPr>
-              <w:t>11. 系统按“业务目标成功率 = 达标任务数 / 可评价任务数 × 100%”汇总展示，当前轮次 30/30 达标。</w:t>
+              <w:t>10. 系统按“业务目标成功率 = 达标任务数 / 可评价任务数 × 100%”汇总展示。正式留档需使用不少于 30 个可评价工单的验收轮次；小批量联调轮次只能证明链路和页面展示能力。</w:t>
             </w:r>
           </w:p>
           <w:p>
@@ -1286,7 +1540,7 @@
                 <w:b w:val="0"/>
                 <w:sz w:val="21"/>
               </w:rPr>
-              <w:t>12. 展开工单详情，检查业务输入、路由放置、GPU 分配、部署状态、检测类别、画框坐标和带框预览图。</w:t>
+              <w:t>11. 展开工单详情，检查业务输入、路由放置、GPU 分配、部署状态、检测类别、画框坐标和带框预览图。</w:t>
             </w:r>
           </w:p>
           <w:p>
@@ -1408,41 +1662,41 @@
                 <w:b w:val="0"/>
                 <w:sz w:val="21"/>
               </w:rPr>
-              <w:t>当前轮次 video-formal-20260610-01 共 30 个工单，30 个可评价且全部达标，业务目标成功率为 100.0%；工单详情可展示 YOLO 检测框、中文类别标签、GPU 分配和帧时延元数据。</w:t>
-            </w:r>
-          </w:p>
-        </w:tc>
-      </w:tr>
-      <w:tr>
-        <w:tc>
-          <w:tcPr>
-            <w:tcW w:type="dxa" w:w="1800"/>
-            <w:shd w:fill="EAF2F8"/>
-          </w:tcPr>
-          <w:p>
-            <w:r/>
-            <w:r>
-              <w:rPr>
-                <w:rFonts w:ascii="宋体" w:hAnsi="宋体" w:eastAsia="宋体"/>
-                <w:b/>
-                <w:sz w:val="21"/>
-              </w:rPr>
-            </w:r>
-          </w:p>
-        </w:tc>
-        <w:tc>
-          <w:tcPr>
-            <w:tcW w:type="dxa" w:w="7800"/>
-          </w:tcPr>
-          <w:p>
-            <w:r/>
-            <w:r>
-              <w:rPr>
-                <w:rFonts w:ascii="宋体" w:hAnsi="宋体" w:eastAsia="宋体"/>
-                <w:b w:val="0"/>
-                <w:sz w:val="21"/>
-              </w:rPr>
-              <w:t>截图已随测试步骤穿插留档，用于证明页面操作、单任务指标、成功率计算和结果详情。</w:t>
+              <w:t>当前视频AI推理链路已完成小批量联调轮次 video-route-pool-check-20260612160633，4 个工单全部可评价且达标；工单详情可展示 YOLO 检测框、中文类别标签、GPU 分配和帧时延元数据。正式 30 个可评价工单的验收轮次仍需重新执行并截图留档。</w:t>
+            </w:r>
+          </w:p>
+        </w:tc>
+      </w:tr>
+      <w:tr>
+        <w:tc>
+          <w:tcPr>
+            <w:tcW w:type="dxa" w:w="1800"/>
+            <w:shd w:fill="EAF2F8"/>
+          </w:tcPr>
+          <w:p>
+            <w:r/>
+            <w:r>
+              <w:rPr>
+                <w:rFonts w:ascii="宋体" w:hAnsi="宋体" w:eastAsia="宋体"/>
+                <w:b/>
+                <w:sz w:val="21"/>
+              </w:rPr>
+            </w:r>
+          </w:p>
+        </w:tc>
+        <w:tc>
+          <w:tcPr>
+            <w:tcW w:type="dxa" w:w="7800"/>
+          </w:tcPr>
+          <w:p>
+            <w:r/>
+            <w:r>
+              <w:rPr>
+                <w:rFonts w:ascii="宋体" w:hAnsi="宋体" w:eastAsia="宋体"/>
+                <w:b w:val="0"/>
+                <w:sz w:val="21"/>
+              </w:rPr>
+              <w:t>截图已随测试步骤穿插留档，用于证明页面操作、单任务指标、成功率计算和任务工单详情。</w:t>
             </w:r>
           </w:p>
         </w:tc>
@@ -1564,6 +1818,41 @@
                 <w:b/>
                 <w:sz w:val="21"/>
               </w:rPr>
+              <w:t>判定方法</w:t>
+            </w:r>
+          </w:p>
+        </w:tc>
+        <w:tc>
+          <w:tcPr>
+            <w:tcW w:type="dxa" w:w="7800"/>
+          </w:tcPr>
+          <w:p>
+            <w:r/>
+            <w:r>
+              <w:rPr>
+                <w:rFonts w:ascii="宋体" w:hAnsi="宋体" w:eastAsia="宋体"/>
+                <w:b w:val="0"/>
+                <w:sz w:val="21"/>
+              </w:rPr>
+              <w:t>本用例为功能性测试，不计算准确率；系统能够根据固定输入正常返回结构化解析结果并完成工单提交，即判定通过。</w:t>
+            </w:r>
+          </w:p>
+        </w:tc>
+      </w:tr>
+      <w:tr>
+        <w:tc>
+          <w:tcPr>
+            <w:tcW w:type="dxa" w:w="1800"/>
+            <w:shd w:fill="EAF2F8"/>
+          </w:tcPr>
+          <w:p>
+            <w:r/>
+            <w:r>
+              <w:rPr>
+                <w:rFonts w:ascii="宋体" w:hAnsi="宋体" w:eastAsia="宋体"/>
+                <w:b/>
+                <w:sz w:val="21"/>
+              </w:rPr>
               <w:t>前置条件</w:t>
             </w:r>
           </w:p>
@@ -1825,7 +2114,7 @@
                 <w:b w:val="0"/>
                 <w:sz w:val="21"/>
               </w:rPr>
-              <w:t>截图已随测试步骤穿插留档，用于证明页面操作、单任务指标、成功率计算和结果详情。</w:t>
+              <w:t>截图已随测试步骤穿插留档，用于证明页面操作、单任务指标、成功率计算和任务工单详情。</w:t>
             </w:r>
           </w:p>
         </w:tc>
@@ -1947,6 +2236,111 @@
                 <w:b/>
                 <w:sz w:val="21"/>
               </w:rPr>
+              <w:t>测试指标</w:t>
+            </w:r>
+          </w:p>
+        </w:tc>
+        <w:tc>
+          <w:tcPr>
+            <w:tcW w:type="dxa" w:w="7800"/>
+          </w:tcPr>
+          <w:p>
+            <w:r/>
+            <w:r>
+              <w:rPr>
+                <w:rFonts w:ascii="宋体" w:hAnsi="宋体" w:eastAsia="宋体"/>
+                <w:b w:val="0"/>
+                <w:sz w:val="21"/>
+              </w:rPr>
+              <w:t>意图解析参数提取准确率，用于衡量系统从自然语言需求中提取关键任务参数的正确程度。</w:t>
+            </w:r>
+          </w:p>
+        </w:tc>
+      </w:tr>
+      <w:tr>
+        <w:tc>
+          <w:tcPr>
+            <w:tcW w:type="dxa" w:w="1800"/>
+            <w:shd w:fill="EAF2F8"/>
+          </w:tcPr>
+          <w:p>
+            <w:r/>
+            <w:r>
+              <w:rPr>
+                <w:rFonts w:ascii="宋体" w:hAnsi="宋体" w:eastAsia="宋体"/>
+                <w:b/>
+                <w:sz w:val="21"/>
+              </w:rPr>
+              <w:t>判定方法</w:t>
+            </w:r>
+          </w:p>
+        </w:tc>
+        <w:tc>
+          <w:tcPr>
+            <w:tcW w:type="dxa" w:w="7800"/>
+          </w:tcPr>
+          <w:p>
+            <w:r/>
+            <w:r>
+              <w:rPr>
+                <w:rFonts w:ascii="宋体" w:hAnsi="宋体" w:eastAsia="宋体"/>
+                <w:b w:val="0"/>
+                <w:sz w:val="21"/>
+              </w:rPr>
+              <w:t>单条样本的关键字段与人工标注结果一致时，判定该样本正确；期望缺失的字段不应被系统幻觉补全。</w:t>
+            </w:r>
+          </w:p>
+        </w:tc>
+      </w:tr>
+      <w:tr>
+        <w:tc>
+          <w:tcPr>
+            <w:tcW w:type="dxa" w:w="1800"/>
+            <w:shd w:fill="EAF2F8"/>
+          </w:tcPr>
+          <w:p>
+            <w:r/>
+            <w:r>
+              <w:rPr>
+                <w:rFonts w:ascii="宋体" w:hAnsi="宋体" w:eastAsia="宋体"/>
+                <w:b/>
+                <w:sz w:val="21"/>
+              </w:rPr>
+              <w:t>统计口径</w:t>
+            </w:r>
+          </w:p>
+        </w:tc>
+        <w:tc>
+          <w:tcPr>
+            <w:tcW w:type="dxa" w:w="7800"/>
+          </w:tcPr>
+          <w:p>
+            <w:r/>
+            <w:r>
+              <w:rPr>
+                <w:rFonts w:ascii="宋体" w:hAnsi="宋体" w:eastAsia="宋体"/>
+                <w:b w:val="0"/>
+                <w:sz w:val="21"/>
+              </w:rPr>
+              <w:t>参数提取准确率 = 正确样本数 / 总样本数 × 100%；正式验收要求准确率不低于 90%。</w:t>
+            </w:r>
+          </w:p>
+        </w:tc>
+      </w:tr>
+      <w:tr>
+        <w:tc>
+          <w:tcPr>
+            <w:tcW w:type="dxa" w:w="1800"/>
+            <w:shd w:fill="EAF2F8"/>
+          </w:tcPr>
+          <w:p>
+            <w:r/>
+            <w:r>
+              <w:rPr>
+                <w:rFonts w:ascii="宋体" w:hAnsi="宋体" w:eastAsia="宋体"/>
+                <w:b/>
+                <w:sz w:val="21"/>
+              </w:rPr>
               <w:t>前置条件</w:t>
             </w:r>
           </w:p>
@@ -1973,17 +2367,17 @@
                 <w:b w:val="0"/>
                 <w:sz w:val="21"/>
               </w:rPr>
-              <w:t>2. 已准备固定意图解析数据集，数据集覆盖多类业务模态、路由策略倾向、口语化表达、缺字段和错误节点等情况。</w:t>
-            </w:r>
-          </w:p>
-          <w:p>
-            <w:r>
-              <w:rPr>
-                <w:rFonts w:ascii="宋体" w:hAnsi="宋体" w:eastAsia="宋体"/>
-                <w:b w:val="0"/>
-                <w:sz w:val="21"/>
-              </w:rPr>
-              <w:t>3. 大模型/智能体评测所需模型配置可用；规则解析仅作为大模型不可用时的兜底回归。</w:t>
+              <w:t>2. 已准备固定意图解析数据集，数据集由自然语言业务需求文本和人工标注结果组成，覆盖不同业务类型、模态、完整输入和缺失参数等常见情况。</w:t>
+            </w:r>
+          </w:p>
+          <w:p>
+            <w:r>
+              <w:rPr>
+                <w:rFonts w:ascii="宋体" w:hAnsi="宋体" w:eastAsia="宋体"/>
+                <w:b w:val="0"/>
+                <w:sz w:val="21"/>
+              </w:rPr>
+              <w:t>3. 大模型/智能体评测所需模型配置可用。</w:t>
             </w:r>
           </w:p>
         </w:tc>
@@ -2283,7 +2677,7 @@
                 <w:b w:val="0"/>
                 <w:sz w:val="21"/>
               </w:rPr>
-              <w:t>截图已随测试步骤穿插留档，用于证明页面操作、单任务指标、成功率计算和结果详情。</w:t>
+              <w:t>截图已随测试步骤穿插留档，用于证明页面操作、单任务指标、成功率计算和任务工单详情。</w:t>
             </w:r>
           </w:p>
         </w:tc>

</xml_diff>

<commit_message>
fix: align intent acceptance plan and validation UI
</commit_message>
<xml_diff>
--- a/docs/智联计算系统测试方案-正式修订版.docx
+++ b/docs/智联计算系统测试方案-正式修订版.docx
@@ -33,7 +33,7 @@
           <w:b w:val="0"/>
           <w:sz w:val="21"/>
         </w:rPr>
-        <w:t>业务目标成功率采用节点同业务参数历史基线作为比较对象。矩阵乘法吞吐量越高越好，单任务达标条件为实际吞吐量不低于节点基线的 80%；视频AI推理时延越低越好，统一解释为业务能力保持率不低于 80%，等价为实际 P90 帧推理时延不超过节点基线 P90 时延的 1.25 倍。该裕量用于覆盖容器化运行、网络转发和系统调度带来的正常波动，不用于容忍同一 GPU 多任务争用。</w:t>
+        <w:t>业务目标成功率采用节点同业务参数历史基线作为比较对象。矩阵乘法吞吐量越高越好，单任务达标条件为实际吞吐量不低于节点基线的 80%；视频AI推理时延越低越好，当前验收口径为实际 P90 帧推理时延不超过节点基线 P90 时延的 1.5 倍。该裕量用于覆盖容器化运行、网络转发和系统调度带来的正常波动，不用于容忍同一 GPU 多任务争用。</w:t>
       </w:r>
     </w:p>
     <w:p>
@@ -1059,7 +1059,7 @@
                 <w:b w:val="0"/>
                 <w:sz w:val="21"/>
               </w:rPr>
-              <w:t>单个工单实际 P90 时延不超过对应节点基线 P90 时延的 1.25 倍时，判定该工单达标。</w:t>
+              <w:t>单个工单实际 P90 时延不超过对应节点基线 P90 时延的 1.5 倍时，判定该工单达标。</w:t>
             </w:r>
           </w:p>
         </w:tc>
@@ -1410,7 +1410,7 @@
                 <w:b w:val="0"/>
                 <w:sz w:val="21"/>
               </w:rPr>
-              <w:t>9. 在测试工单列表中查看每个任务的 P90 帧推理时延、阈值和是否达标；视频时延越低越好，达标阈值按“节点基准 P90 时延 ÷ 0.8”计算，即最多允许比基线高 25%。</w:t>
+              <w:t>9. 在测试工单列表中查看每个任务的 P90 帧推理时延、阈值和是否达标；视频时延越低越好，达标阈值按“节点基准 P90 时延 × 1.5”计算。</w:t>
             </w:r>
           </w:p>
           <w:p>
@@ -1882,6 +1882,16 @@
               <w:t>2. 后端意图解析工作流可正常运行，已配置支持的业务类型、节点名称和参数校验规则。</w:t>
             </w:r>
           </w:p>
+          <w:p>
+            <w:r>
+              <w:rPr>
+                <w:rFonts w:ascii="宋体" w:hAnsi="宋体" w:eastAsia="宋体"/>
+                <w:b w:val="0"/>
+                <w:sz w:val="21"/>
+              </w:rPr>
+              <w:t>3. 系统中已维护 h1-h13 运营商端点和 compute-1~3 算力节点；用户输入的源/目的端点使用 h1-h13，算力节点由系统或路由模块分配。</w:t>
+            </w:r>
+          </w:p>
         </w:tc>
       </w:tr>
       <w:tr>
@@ -1932,7 +1942,7 @@
                 <w:b w:val="0"/>
                 <w:sz w:val="21"/>
               </w:rPr>
-              <w:t>2. 输入固定业务请求：从 compute-1 到 compute-2 创建矩阵乘法任务，填写业务开始和结束时间，并说明路由策略倾向。</w:t>
+              <w:t>2. 输入完整测试文本：我想部署视频AI推理业务，从 h1 到 h2，使用 yolo 模型，分辨率 720p，抽取 100 帧，30fps，现在开始运行 10 分钟，采用低时延转发策略。</w:t>
             </w:r>
           </w:p>
           <w:p>
@@ -1945,7 +1955,7 @@
                 <w:b w:val="0"/>
                 <w:sz w:val="21"/>
               </w:rPr>
-              <w:t>3. 系统返回结构化解析结果，包括业务类型、源节点、目的节点、业务时间窗口、任务参数和模态标签。</w:t>
+              <w:t>3. 系统返回结构化解析结果，包括业务类型、所属模态、源端点、目的端点、业务时间窗口、任务参数和路由策略。</w:t>
             </w:r>
           </w:p>
           <w:p>
@@ -2013,6 +2023,58 @@
               </w:drawing>
             </w:r>
           </w:p>
+          <w:p>
+            <w:pPr>
+              <w:spacing w:after="40"/>
+            </w:pPr>
+            <w:r>
+              <w:rPr>
+                <w:rFonts w:ascii="宋体" w:hAnsi="宋体" w:eastAsia="宋体"/>
+                <w:b w:val="0"/>
+                <w:sz w:val="21"/>
+              </w:rPr>
+              <w:t>5. 新建对话，输入缺失参数测试文本：我想做矩阵乘法任务，从 h1 到 h2，1024 阶矩阵，50 批。确认系统提示需要补充业务运行时间，且补齐前不能提交工单。</w:t>
+            </w:r>
+          </w:p>
+          <w:p>
+            <w:pPr>
+              <w:spacing w:after="40"/>
+            </w:pPr>
+            <w:r>
+              <w:rPr>
+                <w:rFonts w:ascii="宋体" w:hAnsi="宋体" w:eastAsia="宋体"/>
+                <w:b w:val="0"/>
+                <w:sz w:val="21"/>
+              </w:rPr>
+              <w:t>6. 继续补充：现在开始运行 10 分钟。确认系统合并上一轮草稿并允许提交。</w:t>
+            </w:r>
+          </w:p>
+          <w:p>
+            <w:pPr>
+              <w:spacing w:after="40"/>
+            </w:pPr>
+            <w:r>
+              <w:rPr>
+                <w:rFonts w:ascii="宋体" w:hAnsi="宋体" w:eastAsia="宋体"/>
+                <w:b w:val="0"/>
+                <w:sz w:val="21"/>
+              </w:rPr>
+              <w:t>7. 新建对话，输入非法节点测试文本：从 compute-1 到 h2 做矩阵乘法任务，1024 阶矩阵，50 批，现在开始运行 10 分钟。确认系统提示源端点不合法或不能使用计算节点作为用户源/目的端点，且不能提交工单。</w:t>
+            </w:r>
+          </w:p>
+          <w:p>
+            <w:pPr>
+              <w:spacing w:after="40"/>
+            </w:pPr>
+            <w:r>
+              <w:rPr>
+                <w:rFonts w:ascii="宋体" w:hAnsi="宋体" w:eastAsia="宋体"/>
+                <w:b w:val="0"/>
+                <w:sz w:val="21"/>
+              </w:rPr>
+              <w:t>8. 新建对话，输入非法参数测试文本：从 h1 到 h2 做视频AI推理，720p，抽取 100 帧，500fps，现在开始运行 10 分钟。确认系统提示参数不合理，要求修正后才能提交。</w:t>
+            </w:r>
+          </w:p>
         </w:tc>
       </w:tr>
       <w:tr>
@@ -2045,7 +2107,7 @@
                 <w:b w:val="0"/>
                 <w:sz w:val="21"/>
               </w:rPr>
-              <w:t>系统能正常返回生成解析结果即可。</w:t>
+              <w:t>系统能够完成完整输入解析和工单提交；对缺失参数能够追问补全；对不存在节点、计算节点误填为源/目的端点、明显不合理参数能够给出中文提示并阻止提交。</w:t>
             </w:r>
           </w:p>
         </w:tc>
@@ -2080,7 +2142,7 @@
                 <w:b w:val="0"/>
                 <w:sz w:val="21"/>
               </w:rPr>
-              <w:t>当前系统已实现意图对话、参数草稿、确认提交、工单生成和路由请求记录，可在页面展示结构化参数和工单详情。</w:t>
+              <w:t>当前系统已实现意图对话、参数草稿、多轮补全、节点与参数校验、确认提交、工单生成和路由请求记录；正式验收时保存对话页面、结构化参数、缺参/非法值提示和工单详情截图。</w:t>
             </w:r>
           </w:p>
         </w:tc>
@@ -2553,11 +2615,11 @@
                     <a:graphicData uri="http://schemas.openxmlformats.org/drawingml/2006/picture">
                       <pic:pic>
                         <pic:nvPicPr>
-                          <pic:cNvPr id="0" name="intent-evaluation-samples.png"/>
+                          <pic:cNvPr id="0" name="intent-evaluation-dashboard.png"/>
                           <pic:cNvPicPr/>
                         </pic:nvPicPr>
                         <pic:blipFill>
-                          <a:blip r:embed="rId23"/>
+                          <a:blip r:embed="rId22"/>
                           <a:stretch>
                             <a:fillRect/>
                           </a:stretch>

</xml_diff>

<commit_message>
docs: refresh formal acceptance test plan
</commit_message>
<xml_diff>
--- a/docs/智联计算系统测试方案-正式修订版.docx
+++ b/docs/智联计算系统测试方案-正式修订版.docx
@@ -33,7 +33,7 @@
           <w:b w:val="0"/>
           <w:sz w:val="21"/>
         </w:rPr>
-        <w:t>业务目标成功率采用节点同业务参数历史基线作为比较对象。矩阵乘法吞吐量越高越好，单任务达标条件为实际吞吐量不低于节点基线的 80%；视频AI推理时延越低越好，当前验收口径为实际 P90 帧推理时延不超过节点基线 P90 时延的 1.5 倍。该裕量用于覆盖容器化运行、网络转发和系统调度带来的正常波动，不用于容忍同一 GPU 多任务争用。</w:t>
+        <w:t>业务目标成功率采用节点同业务参数历史基线作为比较对象。矩阵乘法吞吐量越高越好，单任务达标条件为实际吞吐量不低于节点基线的 80%；视频AI推理时延越低越好，当前验收口径为实际 P90 帧推理时延不超过节点基线 P90 时延的 1.5 倍。该裕量用于覆盖容器化运行、网络转发和系统调度带来的正常波动，不用于放宽业务目标本身。</w:t>
       </w:r>
     </w:p>
     <w:p>
@@ -435,7 +435,7 @@
                 <w:b w:val="0"/>
                 <w:sz w:val="21"/>
               </w:rPr>
-              <w:t>2. 检查基线区域，确认参与调度的计算节点均有稳定基线值。</w:t>
+              <w:t>2. 检查基线区域，确认参与调度的计算节点均有对应基线值，并查看稳定/波动提示。</w:t>
             </w:r>
           </w:p>
           <w:p>
@@ -448,7 +448,7 @@
                 <w:b w:val="0"/>
                 <w:sz w:val="21"/>
               </w:rPr>
-              <w:t>3. 创建 30 个测评工单，系统生成当前验收轮次 high_throughput_matmul-20260612095418，并写入固定业务参数。</w:t>
+              <w:t>3. 创建 30 个测评工单，系统生成当前验收轮次 high_throughput_matmul-20260621130040，并写入固定业务参数。</w:t>
             </w:r>
           </w:p>
           <w:p>
@@ -526,7 +526,7 @@
                 <w:b w:val="0"/>
                 <w:sz w:val="21"/>
               </w:rPr>
-              <w:t>5. 点击运行测评，系统按小批次执行本轮工单，同一 GPU 同一时刻最多运行 1 个验收任务。</w:t>
+              <w:t>5. 点击运行测评，系统按当前并发任务数小批次执行本轮工单，资源暂不可用时自动等待。</w:t>
             </w:r>
           </w:p>
           <w:p>
@@ -817,7 +817,7 @@
                 <w:b w:val="0"/>
                 <w:sz w:val="21"/>
               </w:rPr>
-              <w:t>当前轮次 high_throughput_matmul-20260612095418 共 30 个工单，30 个可评价且全部达标，业务目标成功率为 100.0%，满足验收要求。</w:t>
+              <w:t>当前管理节点验收轮次 high_throughput_matmul-20260621130040 共 30 个工单，30 个可评价且全部达标，业务目标成功率为 100.0%，满足验收要求。</w:t>
             </w:r>
           </w:p>
         </w:tc>
@@ -1267,7 +1267,7 @@
                 <w:b w:val="0"/>
                 <w:sz w:val="21"/>
               </w:rPr>
-              <w:t>2. 检查基线区域，确认参与调度的计算节点均有当前视频参数对应的稳定基线时延。</w:t>
+              <w:t>2. 检查基线区域，确认参与调度的计算节点均有当前视频参数对应的基线时延，并查看稳定/波动提示。</w:t>
             </w:r>
           </w:p>
           <w:p>
@@ -1358,7 +1358,7 @@
                 <w:b w:val="0"/>
                 <w:sz w:val="21"/>
               </w:rPr>
-              <w:t>5. 点击运行测评，系统按小批次执行本轮工单，同一 GPU 同一时刻最多运行 1 个视频推理任务。</w:t>
+              <w:t>5. 点击运行测评，系统按当前并发任务数小批次执行本轮工单，资源暂不可用时自动等待。</w:t>
             </w:r>
           </w:p>
           <w:p>
@@ -1475,7 +1475,7 @@
                 <w:b w:val="0"/>
                 <w:sz w:val="21"/>
               </w:rPr>
-              <w:t>10. 系统按“业务目标成功率 = 达标任务数 / 可评价任务数 × 100%”汇总展示。正式留档需使用不少于 30 个可评价工单的验收轮次；小批量联调轮次只能证明链路和页面展示能力。</w:t>
+              <w:t>10. 系统按“业务目标成功率 = 达标任务数 / 可评价任务数 × 100%”汇总展示。正式留档需使用不少于 30 个可评价工单的验收轮次。</w:t>
             </w:r>
           </w:p>
           <w:p>
@@ -1662,7 +1662,7 @@
                 <w:b w:val="0"/>
                 <w:sz w:val="21"/>
               </w:rPr>
-              <w:t>当前视频AI推理链路已完成小批量联调轮次 video-route-pool-check-20260612160633，4 个工单全部可评价且达标；工单详情可展示 YOLO 检测框、中文类别标签、GPU 分配和帧时延元数据。正式 30 个可评价工单的验收轮次仍需重新执行并截图留档。</w:t>
+              <w:t>当前管理节点验收轮次 low_latency_video_pipeline-20260621133404 共 30 个工单，30 个可评价且全部达标，业务目标成功率为 100.0%，满足验收要求；工单详情可展示 YOLO 检测框、中文类别标签、GPU 分配和帧时延元数据。</w:t>
             </w:r>
           </w:p>
         </w:tc>
@@ -2439,7 +2439,7 @@
                 <w:b w:val="0"/>
                 <w:sz w:val="21"/>
               </w:rPr>
-              <w:t>3. 大模型/智能体评测所需模型配置可用。</w:t>
+              <w:t>3. 在线大模型/智能体评测所需模型配置可用。</w:t>
             </w:r>
           </w:p>
         </w:tc>
@@ -2492,7 +2492,7 @@
                 <w:b w:val="0"/>
                 <w:sz w:val="21"/>
               </w:rPr>
-              <w:t>2. 选择支持批量推理的大模型，运行智能体/大模型意图解析评测。</w:t>
+              <w:t>2. 选择在线评测模型，运行智能体/大模型意图解析评测。</w:t>
             </w:r>
           </w:p>
           <w:p>
@@ -2505,7 +2505,7 @@
                 <w:b w:val="0"/>
                 <w:sz w:val="21"/>
               </w:rPr>
-              <w:t>3. 系统异步完成数据集评测，展示评测编号、模型名称、总样本数、正确样本数和准确率。</w:t>
+              <w:t>3. 系统逐条调用在线接口完成数据集评测，展示评测编号、模型名称、总样本数、正确样本数和准确率。</w:t>
             </w:r>
           </w:p>
           <w:p>
@@ -2705,7 +2705,7 @@
                 <w:b w:val="0"/>
                 <w:sz w:val="21"/>
               </w:rPr>
-              <w:t>已使用 qwen3.7-plus 对 360 条固定数据集完成大模型/智能体批量评测，正确 348 条，准确率 96.7%，达到 ≥90% 验收目标；评测编号为 intent-eval-20260608-174844-8ca41b57。</w:t>
+              <w:t>已使用在线大模型/智能体对 360 条固定数据集完成逐条评测，正确 348 条，准确率 96.7%，达到 ≥90% 验收目标；评测编号为 intent-eval-20260608-174844-8ca41b57。</w:t>
             </w:r>
           </w:p>
         </w:tc>

</xml_diff>

<commit_message>
docs: update acceptance screenshots
</commit_message>
<xml_diff>
--- a/docs/智联计算系统测试方案-正式修订版.docx
+++ b/docs/智联计算系统测试方案-正式修订版.docx
@@ -471,7 +471,7 @@
             <w:r>
               <w:drawing>
                 <wp:inline xmlns:a="http://schemas.openxmlformats.org/drawingml/2006/main" xmlns:pic="http://schemas.openxmlformats.org/drawingml/2006/picture">
-                  <wp:extent cx="4800600" cy="3162914"/>
+                  <wp:extent cx="4800600" cy="2180272"/>
                   <wp:docPr id="1" name="Picture 1"/>
                   <wp:cNvGraphicFramePr>
                     <a:graphicFrameLocks noChangeAspect="1"/>
@@ -492,7 +492,7 @@
                         <pic:spPr>
                           <a:xfrm>
                             <a:off x="0" y="0"/>
-                            <a:ext cx="4800600" cy="3162914"/>
+                            <a:ext cx="4800600" cy="2180272"/>
                           </a:xfrm>
                           <a:prstGeom prst="rect"/>
                         </pic:spPr>
@@ -588,7 +588,7 @@
             <w:r>
               <w:drawing>
                 <wp:inline xmlns:a="http://schemas.openxmlformats.org/drawingml/2006/main" xmlns:pic="http://schemas.openxmlformats.org/drawingml/2006/picture">
-                  <wp:extent cx="4800600" cy="3162914"/>
+                  <wp:extent cx="4800600" cy="2180272"/>
                   <wp:docPr id="2" name="Picture 2"/>
                   <wp:cNvGraphicFramePr>
                     <a:graphicFrameLocks noChangeAspect="1"/>
@@ -609,7 +609,7 @@
                         <pic:spPr>
                           <a:xfrm>
                             <a:off x="0" y="0"/>
-                            <a:ext cx="4800600" cy="3162914"/>
+                            <a:ext cx="4800600" cy="2180272"/>
                           </a:xfrm>
                           <a:prstGeom prst="rect"/>
                         </pic:spPr>
@@ -653,7 +653,7 @@
             <w:r>
               <w:drawing>
                 <wp:inline xmlns:a="http://schemas.openxmlformats.org/drawingml/2006/main" xmlns:pic="http://schemas.openxmlformats.org/drawingml/2006/picture">
-                  <wp:extent cx="4800600" cy="3162914"/>
+                  <wp:extent cx="4800600" cy="2180272"/>
                   <wp:docPr id="3" name="Picture 3"/>
                   <wp:cNvGraphicFramePr>
                     <a:graphicFrameLocks noChangeAspect="1"/>
@@ -674,7 +674,7 @@
                         <pic:spPr>
                           <a:xfrm>
                             <a:off x="0" y="0"/>
-                            <a:ext cx="4800600" cy="3162914"/>
+                            <a:ext cx="4800600" cy="2180272"/>
                           </a:xfrm>
                           <a:prstGeom prst="rect"/>
                         </pic:spPr>
@@ -1303,7 +1303,7 @@
             <w:r>
               <w:drawing>
                 <wp:inline xmlns:a="http://schemas.openxmlformats.org/drawingml/2006/main" xmlns:pic="http://schemas.openxmlformats.org/drawingml/2006/picture">
-                  <wp:extent cx="4800600" cy="3162914"/>
+                  <wp:extent cx="4800600" cy="2180272"/>
                   <wp:docPr id="5" name="Picture 5"/>
                   <wp:cNvGraphicFramePr>
                     <a:graphicFrameLocks noChangeAspect="1"/>
@@ -1324,7 +1324,7 @@
                         <pic:spPr>
                           <a:xfrm>
                             <a:off x="0" y="0"/>
-                            <a:ext cx="4800600" cy="3162914"/>
+                            <a:ext cx="4800600" cy="2180272"/>
                           </a:xfrm>
                           <a:prstGeom prst="rect"/>
                         </pic:spPr>
@@ -1433,7 +1433,7 @@
             <w:r>
               <w:drawing>
                 <wp:inline xmlns:a="http://schemas.openxmlformats.org/drawingml/2006/main" xmlns:pic="http://schemas.openxmlformats.org/drawingml/2006/picture">
-                  <wp:extent cx="4800600" cy="3162914"/>
+                  <wp:extent cx="4800600" cy="2180272"/>
                   <wp:docPr id="6" name="Picture 6"/>
                   <wp:cNvGraphicFramePr>
                     <a:graphicFrameLocks noChangeAspect="1"/>
@@ -1454,7 +1454,7 @@
                         <pic:spPr>
                           <a:xfrm>
                             <a:off x="0" y="0"/>
-                            <a:ext cx="4800600" cy="3162914"/>
+                            <a:ext cx="4800600" cy="2180272"/>
                           </a:xfrm>
                           <a:prstGeom prst="rect"/>
                         </pic:spPr>
@@ -1498,7 +1498,7 @@
             <w:r>
               <w:drawing>
                 <wp:inline xmlns:a="http://schemas.openxmlformats.org/drawingml/2006/main" xmlns:pic="http://schemas.openxmlformats.org/drawingml/2006/picture">
-                  <wp:extent cx="4800600" cy="3162914"/>
+                  <wp:extent cx="4800600" cy="2180272"/>
                   <wp:docPr id="7" name="Picture 7"/>
                   <wp:cNvGraphicFramePr>
                     <a:graphicFrameLocks noChangeAspect="1"/>
@@ -1519,7 +1519,7 @@
                         <pic:spPr>
                           <a:xfrm>
                             <a:off x="0" y="0"/>
-                            <a:ext cx="4800600" cy="3162914"/>
+                            <a:ext cx="4800600" cy="2180272"/>
                           </a:xfrm>
                           <a:prstGeom prst="rect"/>
                         </pic:spPr>
@@ -1991,7 +1991,7 @@
             <w:r>
               <w:drawing>
                 <wp:inline xmlns:a="http://schemas.openxmlformats.org/drawingml/2006/main" xmlns:pic="http://schemas.openxmlformats.org/drawingml/2006/picture">
-                  <wp:extent cx="4800600" cy="3162914"/>
+                  <wp:extent cx="4800600" cy="2700338"/>
                   <wp:docPr id="9" name="Picture 9"/>
                   <wp:cNvGraphicFramePr>
                     <a:graphicFrameLocks noChangeAspect="1"/>
@@ -2012,7 +2012,7 @@
                         <pic:spPr>
                           <a:xfrm>
                             <a:off x="0" y="0"/>
-                            <a:ext cx="4800600" cy="3162914"/>
+                            <a:ext cx="4800600" cy="2700338"/>
                           </a:xfrm>
                           <a:prstGeom prst="rect"/>
                         </pic:spPr>
@@ -2541,7 +2541,7 @@
             <w:r>
               <w:drawing>
                 <wp:inline xmlns:a="http://schemas.openxmlformats.org/drawingml/2006/main" xmlns:pic="http://schemas.openxmlformats.org/drawingml/2006/picture">
-                  <wp:extent cx="4800600" cy="3162914"/>
+                  <wp:extent cx="4800600" cy="2194560"/>
                   <wp:docPr id="10" name="Picture 10"/>
                   <wp:cNvGraphicFramePr>
                     <a:graphicFrameLocks noChangeAspect="1"/>
@@ -2562,7 +2562,7 @@
                         <pic:spPr>
                           <a:xfrm>
                             <a:off x="0" y="0"/>
-                            <a:ext cx="4800600" cy="3162914"/>
+                            <a:ext cx="4800600" cy="2194560"/>
                           </a:xfrm>
                           <a:prstGeom prst="rect"/>
                         </pic:spPr>
@@ -2606,7 +2606,7 @@
             <w:r>
               <w:drawing>
                 <wp:inline xmlns:a="http://schemas.openxmlformats.org/drawingml/2006/main" xmlns:pic="http://schemas.openxmlformats.org/drawingml/2006/picture">
-                  <wp:extent cx="4800600" cy="3162914"/>
+                  <wp:extent cx="4800600" cy="2194560"/>
                   <wp:docPr id="11" name="Picture 11"/>
                   <wp:cNvGraphicFramePr>
                     <a:graphicFrameLocks noChangeAspect="1"/>
@@ -2615,11 +2615,11 @@
                     <a:graphicData uri="http://schemas.openxmlformats.org/drawingml/2006/picture">
                       <pic:pic>
                         <pic:nvPicPr>
-                          <pic:cNvPr id="0" name="intent-evaluation-dashboard.png"/>
+                          <pic:cNvPr id="0" name="intent-evaluation-samples.png"/>
                           <pic:cNvPicPr/>
                         </pic:nvPicPr>
                         <pic:blipFill>
-                          <a:blip r:embed="rId22"/>
+                          <a:blip r:embed="rId23"/>
                           <a:stretch>
                             <a:fillRect/>
                           </a:stretch>
@@ -2627,7 +2627,7 @@
                         <pic:spPr>
                           <a:xfrm>
                             <a:off x="0" y="0"/>
-                            <a:ext cx="4800600" cy="3162914"/>
+                            <a:ext cx="4800600" cy="2194560"/>
                           </a:xfrm>
                           <a:prstGeom prst="rect"/>
                         </pic:spPr>
@@ -2705,7 +2705,7 @@
                 <w:b w:val="0"/>
                 <w:sz w:val="21"/>
               </w:rPr>
-              <w:t>已使用在线大模型/智能体对 360 条固定数据集完成逐条评测，正确 348 条，准确率 96.7%，达到 ≥90% 验收目标；评测编号为 intent-eval-20260608-174844-8ca41b57。</w:t>
+              <w:t>已在管理节点使用在线大模型/智能体对 360 条固定数据集完成逐条评测，正确 349 条，准确率 96.9%，达到 ≥90% 验收目标；评测编号为 online-eval-20260621-003559-2794dec2。</w:t>
             </w:r>
           </w:p>
         </w:tc>

</xml_diff>